<commit_message>
docs(paper): 图片 final QA + 修 Figure 1(B) 重叠，正文理论未改
仅图片/构建收口，不动理论。

QA 结论（逐张核）:
- TIF 与对应 PNG 逐像素一致(5/5 identical)，非只文件名一致；DOCX 嵌图与源 PNG 逐像素一致且顺序正确。
- Figure 1..5 内容与 FIGURE_MAP/caption 一一对应：control architecture / proxy map /
  ROS coupling / clinical radar / protocol。
- 无 SRT/ontological/Ĝθ/Latent-Manifest-Convergence 残留；无灰字(残留 #999 仅箭头/框边)；
  字号可读；图号与 caption 一致。

修复:
- Figure 1(B) 预算公式 dq/dt≤… 原压住 "Stressed Agent" x 轴标签 → 下移到标签下方独立一行，消除重叠。
- 送审 .md 末尾嵌入 5 张图(在 Table 5 后)，使 DOCX/PDF 自足可审、与原 1837760 版式一致；
  图 alt 置空避免 pandoc 重复生成 "Figure N" 副标。

构建:
- 重新生成 fig1 PNG、Figure1 TIF/JPG、zips；重建 HTML/DOCX。
- **PDF 改用 headless Chrome 从 HTML 生成**：docx2pdf 驱动 Word 时抓错了前台的无关文档(银豹供应链手册)，
  故弃用；Chrome 版含 5 图、数学渲染正常、无误文档。DOCX 仍是权威上传件(原生公式+行号+嵌图已验证)。
- checklist 增补 PDF 构建告警与 Word-free 方案。

Co-Authored-By: Claude Fable 5 <noreply@anthropic.com>
</commit_message>
<xml_diff>
--- a/papers/ontological_friction/paper_ontological_friction_frontiers_submission.docx
+++ b/papers/ontological_friction/paper_ontological_friction_frontiers_submission.docx
@@ -1,8 +1,8 @@
 
 <file path=word/document.xml><?xml version="1.0" encoding="utf-8"?>
-<w:document xmlns:ns1="urn:schemas-microsoft-com:vml" xmlns:ns2="urn:schemas-microsoft-com:office:office" xmlns:ns3="http://schemas.openxmlformats.org/officeDocument/2006/math" xmlns:r="http://schemas.openxmlformats.org/officeDocument/2006/relationships" xmlns:w="http://schemas.openxmlformats.org/wordprocessingml/2006/main">
+<w:document xmlns:ns1="urn:schemas-microsoft-com:vml" xmlns:ns2="urn:schemas-microsoft-com:office:office" xmlns:ns3="http://schemas.openxmlformats.org/officeDocument/2006/math" xmlns:ns4="http://schemas.openxmlformats.org/drawingml/2006/wordprocessingDrawing" xmlns:ns5="http://schemas.openxmlformats.org/drawingml/2006/main" xmlns:ns6="http://schemas.openxmlformats.org/drawingml/2006/picture" xmlns:r="http://schemas.openxmlformats.org/officeDocument/2006/relationships" xmlns:w="http://schemas.openxmlformats.org/wordprocessingml/2006/main">
   <w:body>
-    <w:bookmarkStart w:id="61" w:name="X17ac48278c299894c19d5e5ce607d2013ab145f"/>
+    <w:bookmarkStart w:id="77" w:name="X17ac48278c299894c19d5e5ce607d2013ab145f"/>
     <w:p>
       <w:pPr>
         <w:pStyle w:val="Heading1"/>
@@ -23205,8 +23205,475 @@
         </w:tc>
       </w:tr>
     </w:tbl>
+    <w:p>
+      <w:r>
+        <w:pict>
+          <ns1:rect style="width:0;height:1.5pt" ns2:hralign="center" ns2:hrstd="t" ns2:hr="t"/>
+        </w:pict>
+      </w:r>
+    </w:p>
     <w:bookmarkEnd w:id="60"/>
-    <w:bookmarkEnd w:id="61"/>
+    <w:bookmarkStart w:id="76" w:name="figures"/>
+    <w:p>
+      <w:pPr>
+        <w:pStyle w:val="Heading2"/>
+      </w:pPr>
+      <w:r>
+        <w:t xml:space="preserve">Figures</w:t>
+      </w:r>
+    </w:p>
+    <w:p>
+      <w:pPr>
+        <w:pStyle w:val="FirstParagraph"/>
+      </w:pPr>
+      <w:r>
+        <w:rPr>
+          <w:i/>
+          <w:iCs/>
+        </w:rPr>
+        <w:t xml:space="preserve">Figures are embedded here for review and are also provided as separate high-resolution files (Figure1–Figure5).</w:t>
+      </w:r>
+    </w:p>
+    <w:p>
+      <w:pPr>
+        <w:pStyle w:val="BodyText"/>
+      </w:pPr>
+      <w:r>
+        <w:rPr>
+          <w:b/>
+          <w:bCs/>
+        </w:rPr>
+        <w:t xml:space="preserve">Figure 1.</w:t>
+      </w:r>
+      <w:r>
+        <w:t xml:space="preserve"> </w:t>
+      </w:r>
+      <w:r>
+        <w:rPr>
+          <w:i/>
+          <w:iCs/>
+        </w:rPr>
+        <w:t xml:space="preserve">Hierarchical control architecture and selection power budget.</w:t>
+      </w:r>
+    </w:p>
+    <w:p>
+      <w:pPr>
+        <w:pStyle w:val="BodyText"/>
+      </w:pPr>
+      <w:r>
+        <w:drawing>
+          <ns4:inline>
+            <ns4:extent cx="5943600" cy="6704339"/>
+            <ns4:effectExtent b="0" l="0" r="0" t="0"/>
+            <ns4:docPr descr="" title="" id="62" name="Picture"/>
+            <ns5:graphic>
+              <ns5:graphicData uri="http://schemas.openxmlformats.org/drawingml/2006/picture">
+                <ns6:pic>
+                  <ns6:nvPicPr>
+                    <ns6:cNvPr descr="figures/fig1_control_architecture.png" id="63" name="Picture"/>
+                    <ns6:cNvPicPr>
+                      <ns5:picLocks noChangeArrowheads="1" noChangeAspect="1"/>
+                    </ns6:cNvPicPr>
+                  </ns6:nvPicPr>
+                  <ns6:blipFill>
+                    <ns5:blip r:embed="rId61"/>
+                    <ns5:stretch>
+                      <ns5:fillRect/>
+                    </ns5:stretch>
+                  </ns6:blipFill>
+                  <ns6:spPr bwMode="auto">
+                    <ns5:xfrm>
+                      <ns5:off x="0" y="0"/>
+                      <ns5:ext cx="5943600" cy="6704339"/>
+                    </ns5:xfrm>
+                    <ns5:prstGeom prst="rect">
+                      <ns5:avLst/>
+                    </ns5:prstGeom>
+                    <ns5:noFill/>
+                    <ns5:ln w="9525">
+                      <ns5:noFill/>
+                      <ns5:headEnd/>
+                      <ns5:tailEnd/>
+                    </ns5:ln>
+                  </ns6:spPr>
+                </ns6:pic>
+              </ns5:graphicData>
+            </ns5:graphic>
+          </ns4:inline>
+        </w:drawing>
+      </w:r>
+    </w:p>
+    <w:p>
+      <w:pPr>
+        <w:pStyle w:val="BodyText"/>
+      </w:pPr>
+      <w:r>
+        <w:rPr>
+          <w:b/>
+          <w:bCs/>
+        </w:rPr>
+        <w:t xml:space="preserve">Figure 2.</w:t>
+      </w:r>
+      <w:r>
+        <w:t xml:space="preserve"> </w:t>
+      </w:r>
+      <w:r>
+        <w:rPr>
+          <w:i/>
+          <w:iCs/>
+        </w:rPr>
+        <w:t xml:space="preserve">Cross-modal operationalization map for executive friction (</w:t>
+      </w:r>
+      <ns3:oMath>
+        <ns3:sSub>
+          <ns3:e>
+            <ns3:r>
+              <ns3:rPr>
+                <ns3:sty ns3:val="p"/>
+              </ns3:rPr>
+              <ns3:t>Ψ</ns3:t>
+            </ns3:r>
+          </ns3:e>
+          <ns3:sub>
+            <ns3:r>
+              <ns3:t>f</ns3:t>
+            </ns3:r>
+          </ns3:sub>
+        </ns3:sSub>
+      </ns3:oMath>
+      <w:r>
+        <w:rPr>
+          <w:i/>
+          <w:iCs/>
+        </w:rPr>
+        <w:t xml:space="preserve">).</w:t>
+      </w:r>
+    </w:p>
+    <w:p>
+      <w:pPr>
+        <w:pStyle w:val="BodyText"/>
+      </w:pPr>
+      <w:r>
+        <w:drawing>
+          <ns4:inline>
+            <ns4:extent cx="5943600" cy="5209513"/>
+            <ns4:effectExtent b="0" l="0" r="0" t="0"/>
+            <ns4:docPr descr="" title="" id="65" name="Picture"/>
+            <ns5:graphic>
+              <ns5:graphicData uri="http://schemas.openxmlformats.org/drawingml/2006/picture">
+                <ns6:pic>
+                  <ns6:nvPicPr>
+                    <ns6:cNvPr descr="figures/fig2_proxy_map.png" id="66" name="Picture"/>
+                    <ns6:cNvPicPr>
+                      <ns5:picLocks noChangeArrowheads="1" noChangeAspect="1"/>
+                    </ns6:cNvPicPr>
+                  </ns6:nvPicPr>
+                  <ns6:blipFill>
+                    <ns5:blip r:embed="rId64"/>
+                    <ns5:stretch>
+                      <ns5:fillRect/>
+                    </ns5:stretch>
+                  </ns6:blipFill>
+                  <ns6:spPr bwMode="auto">
+                    <ns5:xfrm>
+                      <ns5:off x="0" y="0"/>
+                      <ns5:ext cx="5943600" cy="5209513"/>
+                    </ns5:xfrm>
+                    <ns5:prstGeom prst="rect">
+                      <ns5:avLst/>
+                    </ns5:prstGeom>
+                    <ns5:noFill/>
+                    <ns5:ln w="9525">
+                      <ns5:noFill/>
+                      <ns5:headEnd/>
+                      <ns5:tailEnd/>
+                    </ns5:ln>
+                  </ns6:spPr>
+                </ns6:pic>
+              </ns5:graphicData>
+            </ns5:graphic>
+          </ns4:inline>
+        </w:drawing>
+      </w:r>
+    </w:p>
+    <w:p>
+      <w:pPr>
+        <w:pStyle w:val="BodyText"/>
+      </w:pPr>
+      <w:r>
+        <w:rPr>
+          <w:b/>
+          <w:bCs/>
+        </w:rPr>
+        <w:t xml:space="preserve">Figure 3.</w:t>
+      </w:r>
+      <w:r>
+        <w:t xml:space="preserve"> </w:t>
+      </w:r>
+      <w:r>
+        <w:rPr>
+          <w:i/>
+          <w:iCs/>
+        </w:rPr>
+        <w:t xml:space="preserve">ROS–</w:t>
+      </w:r>
+      <ns3:oMath>
+        <ns3:sSub>
+          <ns3:e>
+            <ns3:r>
+              <ns3:rPr>
+                <ns3:sty ns3:val="p"/>
+              </ns3:rPr>
+              <ns3:t>Ψ</ns3:t>
+            </ns3:r>
+          </ns3:e>
+          <ns3:sub>
+            <ns3:r>
+              <ns3:t>f</ns3:t>
+            </ns3:r>
+          </ns3:sub>
+        </ns3:sSub>
+      </ns3:oMath>
+      <w:r>
+        <w:rPr>
+          <w:i/>
+          <w:iCs/>
+        </w:rPr>
+        <w:t xml:space="preserve"> </w:t>
+      </w:r>
+      <w:r>
+        <w:rPr>
+          <w:i/>
+          <w:iCs/>
+        </w:rPr>
+        <w:t xml:space="preserve">coupling mechanism: from executive friction to clinical expression.</w:t>
+      </w:r>
+    </w:p>
+    <w:p>
+      <w:pPr>
+        <w:pStyle w:val="BodyText"/>
+      </w:pPr>
+      <w:r>
+        <w:drawing>
+          <ns4:inline>
+            <ns4:extent cx="5943600" cy="3343700"/>
+            <ns4:effectExtent b="0" l="0" r="0" t="0"/>
+            <ns4:docPr descr="" title="" id="68" name="Picture"/>
+            <ns5:graphic>
+              <ns5:graphicData uri="http://schemas.openxmlformats.org/drawingml/2006/picture">
+                <ns6:pic>
+                  <ns6:nvPicPr>
+                    <ns6:cNvPr descr="figures/fig3_ros_coupling.png" id="69" name="Picture"/>
+                    <ns6:cNvPicPr>
+                      <ns5:picLocks noChangeArrowheads="1" noChangeAspect="1"/>
+                    </ns6:cNvPicPr>
+                  </ns6:nvPicPr>
+                  <ns6:blipFill>
+                    <ns5:blip r:embed="rId67"/>
+                    <ns5:stretch>
+                      <ns5:fillRect/>
+                    </ns5:stretch>
+                  </ns6:blipFill>
+                  <ns6:spPr bwMode="auto">
+                    <ns5:xfrm>
+                      <ns5:off x="0" y="0"/>
+                      <ns5:ext cx="5943600" cy="3343700"/>
+                    </ns5:xfrm>
+                    <ns5:prstGeom prst="rect">
+                      <ns5:avLst/>
+                    </ns5:prstGeom>
+                    <ns5:noFill/>
+                    <ns5:ln w="9525">
+                      <ns5:noFill/>
+                      <ns5:headEnd/>
+                      <ns5:tailEnd/>
+                    </ns5:ln>
+                  </ns6:spPr>
+                </ns6:pic>
+              </ns5:graphicData>
+            </ns5:graphic>
+          </ns4:inline>
+        </w:drawing>
+      </w:r>
+    </w:p>
+    <w:p>
+      <w:pPr>
+        <w:pStyle w:val="BodyText"/>
+      </w:pPr>
+      <w:r>
+        <w:rPr>
+          <w:b/>
+          <w:bCs/>
+        </w:rPr>
+        <w:t xml:space="preserve">Figure 4.</w:t>
+      </w:r>
+      <w:r>
+        <w:t xml:space="preserve"> </w:t>
+      </w:r>
+      <w:r>
+        <w:rPr>
+          <w:i/>
+          <w:iCs/>
+        </w:rPr>
+        <w:t xml:space="preserve">Predicted</w:t>
+      </w:r>
+      <w:r>
+        <w:rPr>
+          <w:i/>
+          <w:iCs/>
+        </w:rPr>
+        <w:t xml:space="preserve"> </w:t>
+      </w:r>
+      <ns3:oMath>
+        <ns3:sSub>
+          <ns3:e>
+            <ns3:r>
+              <ns3:rPr>
+                <ns3:sty ns3:val="p"/>
+              </ns3:rPr>
+              <ns3:t>Ψ</ns3:t>
+            </ns3:r>
+          </ns3:e>
+          <ns3:sub>
+            <ns3:r>
+              <ns3:t>f</ns3:t>
+            </ns3:r>
+          </ns3:sub>
+        </ns3:sSub>
+      </ns3:oMath>
+      <w:r>
+        <w:rPr>
+          <w:i/>
+          <w:iCs/>
+        </w:rPr>
+        <w:t xml:space="preserve"> </w:t>
+      </w:r>
+      <w:r>
+        <w:rPr>
+          <w:i/>
+          <w:iCs/>
+        </w:rPr>
+        <w:t xml:space="preserve">proxy signatures across clinical conditions.</w:t>
+      </w:r>
+    </w:p>
+    <w:p>
+      <w:pPr>
+        <w:pStyle w:val="BodyText"/>
+      </w:pPr>
+      <w:r>
+        <w:drawing>
+          <ns4:inline>
+            <ns4:extent cx="5943600" cy="5344197"/>
+            <ns4:effectExtent b="0" l="0" r="0" t="0"/>
+            <ns4:docPr descr="" title="" id="71" name="Picture"/>
+            <ns5:graphic>
+              <ns5:graphicData uri="http://schemas.openxmlformats.org/drawingml/2006/picture">
+                <ns6:pic>
+                  <ns6:nvPicPr>
+                    <ns6:cNvPr descr="figures/fig4_clinical_radar.png" id="72" name="Picture"/>
+                    <ns6:cNvPicPr>
+                      <ns5:picLocks noChangeArrowheads="1" noChangeAspect="1"/>
+                    </ns6:cNvPicPr>
+                  </ns6:nvPicPr>
+                  <ns6:blipFill>
+                    <ns5:blip r:embed="rId70"/>
+                    <ns5:stretch>
+                      <ns5:fillRect/>
+                    </ns5:stretch>
+                  </ns6:blipFill>
+                  <ns6:spPr bwMode="auto">
+                    <ns5:xfrm>
+                      <ns5:off x="0" y="0"/>
+                      <ns5:ext cx="5943600" cy="5344197"/>
+                    </ns5:xfrm>
+                    <ns5:prstGeom prst="rect">
+                      <ns5:avLst/>
+                    </ns5:prstGeom>
+                    <ns5:noFill/>
+                    <ns5:ln w="9525">
+                      <ns5:noFill/>
+                      <ns5:headEnd/>
+                      <ns5:tailEnd/>
+                    </ns5:ln>
+                  </ns6:spPr>
+                </ns6:pic>
+              </ns5:graphicData>
+            </ns5:graphic>
+          </ns4:inline>
+        </w:drawing>
+      </w:r>
+    </w:p>
+    <w:p>
+      <w:pPr>
+        <w:pStyle w:val="BodyText"/>
+      </w:pPr>
+      <w:r>
+        <w:rPr>
+          <w:b/>
+          <w:bCs/>
+        </w:rPr>
+        <w:t xml:space="preserve">Figure 5.</w:t>
+      </w:r>
+      <w:r>
+        <w:t xml:space="preserve"> </w:t>
+      </w:r>
+      <w:r>
+        <w:rPr>
+          <w:i/>
+          <w:iCs/>
+        </w:rPr>
+        <w:t xml:space="preserve">Core-chain protocol and critical-load prediction.</w:t>
+      </w:r>
+    </w:p>
+    <w:p>
+      <w:pPr>
+        <w:pStyle w:val="BodyText"/>
+      </w:pPr>
+      <w:r>
+        <w:drawing>
+          <ns4:inline>
+            <ns4:extent cx="5943600" cy="6952859"/>
+            <ns4:effectExtent b="0" l="0" r="0" t="0"/>
+            <ns4:docPr descr="" title="" id="74" name="Picture"/>
+            <ns5:graphic>
+              <ns5:graphicData uri="http://schemas.openxmlformats.org/drawingml/2006/picture">
+                <ns6:pic>
+                  <ns6:nvPicPr>
+                    <ns6:cNvPr descr="figures/fig5_protocol.png" id="75" name="Picture"/>
+                    <ns6:cNvPicPr>
+                      <ns5:picLocks noChangeArrowheads="1" noChangeAspect="1"/>
+                    </ns6:cNvPicPr>
+                  </ns6:nvPicPr>
+                  <ns6:blipFill>
+                    <ns5:blip r:embed="rId73"/>
+                    <ns5:stretch>
+                      <ns5:fillRect/>
+                    </ns5:stretch>
+                  </ns6:blipFill>
+                  <ns6:spPr bwMode="auto">
+                    <ns5:xfrm>
+                      <ns5:off x="0" y="0"/>
+                      <ns5:ext cx="5943600" cy="6952859"/>
+                    </ns5:xfrm>
+                    <ns5:prstGeom prst="rect">
+                      <ns5:avLst/>
+                    </ns5:prstGeom>
+                    <ns5:noFill/>
+                    <ns5:ln w="9525">
+                      <ns5:noFill/>
+                      <ns5:headEnd/>
+                      <ns5:tailEnd/>
+                    </ns5:ln>
+                  </ns6:spPr>
+                </ns6:pic>
+              </ns5:graphicData>
+            </ns5:graphic>
+          </ns4:inline>
+        </w:drawing>
+      </w:r>
+    </w:p>
+    <w:bookmarkEnd w:id="76"/>
+    <w:bookmarkEnd w:id="77"/>
     <w:sectPr>
       <w:footerReference w:type="default" r:id="rId999"/>
       <w:lnNumType w:countBy="1" w:start="1" w:restart="newPage" w:distance="360"/>

</xml_diff>